<commit_message>
Appendix A sentence updated: the cards are attached within this appendix
The docx (and all three derived PDFs) now say the 130 navigation cards
follow inside appendix A itself rather than as a companion file.

Co-Authored-By: Claude Fable 5 <noreply@anthropic.com>
</commit_message>
<xml_diff>
--- a/הצעת_יוזמה_תנופה_תשפז_סדנת_ארדואינו.docx
+++ b/הצעת_יוזמה_תנופה_תשפז_סדנת_ארדואינו.docx
@@ -1,5 +1,52 @@
 
-<file path=word/document.xml><?xml version="1.0" encoding="utf-8"?>
+<file path=docProps\app.xml><?xml version="1.0" encoding="utf-8"?>
+<Properties xmlns="http://schemas.openxmlformats.org/officeDocument/2006/extended-properties" xmlns:vt="http://schemas.openxmlformats.org/officeDocument/2006/docPropsVTypes">
+  <Template>Normal.dotm</Template>
+  <TotalTime>166</TotalTime>
+  <Pages>17</Pages>
+  <Words>4816</Words>
+  <Characters>27454</Characters>
+  <Application>Microsoft Office Word</Application>
+  <DocSecurity>0</DocSecurity>
+  <Lines>228</Lines>
+  <Paragraphs>64</Paragraphs>
+  <ScaleCrop>false</ScaleCrop>
+  <HeadingPairs>
+    <vt:vector size="2" baseType="variant">
+      <vt:variant>
+        <vt:lpstr>Title</vt:lpstr>
+      </vt:variant>
+      <vt:variant>
+        <vt:i4>1</vt:i4>
+      </vt:variant>
+    </vt:vector>
+  </HeadingPairs>
+  <TitlesOfParts>
+    <vt:vector size="1" baseType="lpstr">
+      <vt:lpstr>סדנת ארדואינו דיפרנציאלית בתמיכת בינה מלאכותית — הצעת יוזמה חינוכית תשפ"ז</vt:lpstr>
+    </vt:vector>
+  </TitlesOfParts>
+  <Company/>
+  <LinksUpToDate>false</LinksUpToDate>
+  <CharactersWithSpaces>32206</CharactersWithSpaces>
+  <SharedDoc>false</SharedDoc>
+  <HyperlinksChanged>false</HyperlinksChanged>
+  <AppVersion>16.0000</AppVersion>
+</Properties>
+</file>
+
+<file path=docProps\core.xml><?xml version="1.0" encoding="utf-8"?>
+<cp:coreProperties xmlns:cp="http://schemas.openxmlformats.org/package/2006/metadata/core-properties" xmlns:dc="http://purl.org/dc/elements/1.1/" xmlns:dcterms="http://purl.org/dc/terms/" xmlns:dcmitype="http://purl.org/dc/dcmitype/" xmlns:xsi="http://www.w3.org/2001/XMLSchema-instance">
+  <dc:title>סדנת ארדואינו דיפרנציאלית בתמיכת בינה מלאכותית — הצעת יוזמה חינוכית תשפ"ז</dc:title>
+  <dc:creator>יונתן לב אל</dc:creator>
+  <cp:lastModifiedBy>יהונתן לב אל</cp:lastModifiedBy>
+  <cp:revision>24</cp:revision>
+  <dcterms:created xsi:type="dcterms:W3CDTF">2026-09-12T10:46:00Z</dcterms:created>
+  <dcterms:modified xsi:type="dcterms:W3CDTF">2026-09-13T19:09:00Z</dcterms:modified>
+</cp:coreProperties>
+</file>
+
+<file path=word\document.xml><?xml version="1.0" encoding="utf-8"?>
 <w:document xmlns:wpc="http://schemas.microsoft.com/office/word/2010/wordprocessingCanvas" xmlns:cx="http://schemas.microsoft.com/office/drawing/2014/chartex" xmlns:cx1="http://schemas.microsoft.com/office/drawing/2015/9/8/chartex" xmlns:cx2="http://schemas.microsoft.com/office/drawing/2015/10/21/chartex" xmlns:cx3="http://schemas.microsoft.com/office/drawing/2016/5/9/chartex" xmlns:cx4="http://schemas.microsoft.com/office/drawing/2016/5/10/chartex" xmlns:cx5="http://schemas.microsoft.com/office/drawing/2016/5/11/chartex" xmlns:cx6="http://schemas.microsoft.com/office/drawing/2016/5/12/chartex" xmlns:cx7="http://schemas.microsoft.com/office/drawing/2016/5/13/chartex" xmlns:cx8="http://schemas.microsoft.com/office/drawing/2016/5/14/chartex" xmlns:mc="http://schemas.openxmlformats.org/markup-compatibility/2006" xmlns:aink="http://schemas.microsoft.com/office/drawing/2016/ink" xmlns:am3d="http://schemas.microsoft.com/office/drawing/2017/model3d" xmlns:o="urn:schemas-microsoft-com:office:office" xmlns:oel="http://schemas.microsoft.com/office/2019/extlst" xmlns:r="http://schemas.openxmlformats.org/officeDocument/2006/relationships" xmlns:m="http://schemas.openxmlformats.org/officeDocument/2006/math" xmlns:v="urn:schemas-microsoft-com:vml" xmlns:wp14="http://schemas.microsoft.com/office/word/2010/wordprocessingDrawing" xmlns:wp="http://schemas.openxmlformats.org/drawingml/2006/wordprocessingDrawing" xmlns:w10="urn:schemas-microsoft-com:office:word" xmlns:w="http://schemas.openxmlformats.org/wordprocessingml/2006/main" xmlns:w14="http://schemas.microsoft.com/office/word/2010/wordml" xmlns:w15="http://schemas.microsoft.com/office/word/2012/wordml" xmlns:w16cex="http://schemas.microsoft.com/office/word/2018/wordml/cex" xmlns:w16cid="http://schemas.microsoft.com/office/word/2016/wordml/cid" xmlns:w16="http://schemas.microsoft.com/office/word/2018/wordml" xmlns:w16du="http://schemas.microsoft.com/office/word/2023/wordml/word16du" xmlns:w16sdtdh="http://schemas.microsoft.com/office/word/2020/wordml/sdtdatahash" xmlns:w16sdtfl="http://schemas.microsoft.com/office/word/2024/wordml/sdtformatlock" xmlns:w16se="http://schemas.microsoft.com/office/word/2015/wordml/symex" xmlns:wpg="http://schemas.microsoft.com/office/word/2010/wordprocessingGroup" xmlns:wpi="http://schemas.microsoft.com/office/word/2010/wordprocessingInk" xmlns:wne="http://schemas.microsoft.com/office/word/2006/wordml" xmlns:wps="http://schemas.microsoft.com/office/word/2010/wordprocessingShape" mc:Ignorable="w14 w15 w16se w16cid w16 w16cex w16sdtdh w16sdtfl w16du wp14">
   <w:body>
     <w:p>
@@ -12098,7 +12145,7 @@
           <w:color w:val="000000" w:themeColor="text1"/>
           <w:rtl/>
         </w:rPr>
-        <w:t xml:space="preserve">כרטיסיות הניווט של שמונת הפרויקטים (130 כרטיסיות) מצורפות כקובץ נלווה, כפי שהן מודפסות ומונחות על שולחן העבודה. הגרסה המקוונת זמינה באתר התלמידים: </w:t>
+        <w:t xml:space="preserve">כרטיסיות הניווט של שמונת הפרויקטים (130 כרטיסיות) מצורפות בהמשך נספח זה, כפי שהן מודפסות ומונחות על שולחן העבודה. הגרסה המקוונת זמינה באתר התלמידים: </w:t>
       </w:r>
       <w:hyperlink r:id="rId8">
         <w:r>
@@ -12117,6 +12164,7 @@
     </w:p>
     <w:p>
       <w:pPr>
+        <w:pageBreakBefore/>
         <w:pStyle w:val="Heading1"/>
         <w:keepNext/>
         <w:bidi/>
@@ -25040,7 +25088,7 @@
 </w:document>
 </file>
 
-<file path=word/endnotes.xml><?xml version="1.0" encoding="utf-8"?>
+<file path=word\endnotes.xml><?xml version="1.0" encoding="utf-8"?>
 <w:endnotes xmlns:wpc="http://schemas.microsoft.com/office/word/2010/wordprocessingCanvas" xmlns:cx="http://schemas.microsoft.com/office/drawing/2014/chartex" xmlns:cx1="http://schemas.microsoft.com/office/drawing/2015/9/8/chartex" xmlns:cx2="http://schemas.microsoft.com/office/drawing/2015/10/21/chartex" xmlns:cx3="http://schemas.microsoft.com/office/drawing/2016/5/9/chartex" xmlns:cx4="http://schemas.microsoft.com/office/drawing/2016/5/10/chartex" xmlns:cx5="http://schemas.microsoft.com/office/drawing/2016/5/11/chartex" xmlns:cx6="http://schemas.microsoft.com/office/drawing/2016/5/12/chartex" xmlns:cx7="http://schemas.microsoft.com/office/drawing/2016/5/13/chartex" xmlns:cx8="http://schemas.microsoft.com/office/drawing/2016/5/14/chartex" xmlns:mc="http://schemas.openxmlformats.org/markup-compatibility/2006" xmlns:aink="http://schemas.microsoft.com/office/drawing/2016/ink" xmlns:am3d="http://schemas.microsoft.com/office/drawing/2017/model3d" xmlns:o="urn:schemas-microsoft-com:office:office" xmlns:oel="http://schemas.microsoft.com/office/2019/extlst" xmlns:r="http://schemas.openxmlformats.org/officeDocument/2006/relationships" xmlns:m="http://schemas.openxmlformats.org/officeDocument/2006/math" xmlns:v="urn:schemas-microsoft-com:vml" xmlns:wp14="http://schemas.microsoft.com/office/word/2010/wordprocessingDrawing" xmlns:wp="http://schemas.openxmlformats.org/drawingml/2006/wordprocessingDrawing" xmlns:w10="urn:schemas-microsoft-com:office:word" xmlns:w="http://schemas.openxmlformats.org/wordprocessingml/2006/main" xmlns:w14="http://schemas.microsoft.com/office/word/2010/wordml" xmlns:w15="http://schemas.microsoft.com/office/word/2012/wordml" xmlns:w16cex="http://schemas.microsoft.com/office/word/2018/wordml/cex" xmlns:w16cid="http://schemas.microsoft.com/office/word/2016/wordml/cid" xmlns:w16="http://schemas.microsoft.com/office/word/2018/wordml" xmlns:w16du="http://schemas.microsoft.com/office/word/2023/wordml/word16du" xmlns:w16sdtdh="http://schemas.microsoft.com/office/word/2020/wordml/sdtdatahash" xmlns:w16sdtfl="http://schemas.microsoft.com/office/word/2024/wordml/sdtformatlock" xmlns:w16se="http://schemas.microsoft.com/office/word/2015/wordml/symex" xmlns:wpg="http://schemas.microsoft.com/office/word/2010/wordprocessingGroup" xmlns:wpi="http://schemas.microsoft.com/office/word/2010/wordprocessingInk" xmlns:wne="http://schemas.microsoft.com/office/word/2006/wordml" xmlns:wps="http://schemas.microsoft.com/office/word/2010/wordprocessingShape" mc:Ignorable="w14 w15 w16se w16cid w16 w16cex w16sdtdh w16sdtfl w16du wp14">
   <w:endnote w:type="separator" w:id="-1">
     <w:p>
@@ -25059,7 +25107,59 @@
 </w:endnotes>
 </file>
 
-<file path=word/footer1.xml><?xml version="1.0" encoding="utf-8"?>
+<file path=word\fontTable.xml><?xml version="1.0" encoding="utf-8"?>
+<w:fonts xmlns:mc="http://schemas.openxmlformats.org/markup-compatibility/2006" xmlns:r="http://schemas.openxmlformats.org/officeDocument/2006/relationships" xmlns:w="http://schemas.openxmlformats.org/wordprocessingml/2006/main" xmlns:w14="http://schemas.microsoft.com/office/word/2010/wordml" xmlns:w15="http://schemas.microsoft.com/office/word/2012/wordml" xmlns:w16cex="http://schemas.microsoft.com/office/word/2018/wordml/cex" xmlns:w16cid="http://schemas.microsoft.com/office/word/2016/wordml/cid" xmlns:w16="http://schemas.microsoft.com/office/word/2018/wordml" xmlns:w16du="http://schemas.microsoft.com/office/word/2023/wordml/word16du" xmlns:w16sdtdh="http://schemas.microsoft.com/office/word/2020/wordml/sdtdatahash" xmlns:w16sdtfl="http://schemas.microsoft.com/office/word/2024/wordml/sdtformatlock" xmlns:w16se="http://schemas.microsoft.com/office/word/2015/wordml/symex" mc:Ignorable="w14 w15 w16se w16cid w16 w16cex w16sdtdh w16sdtfl w16du">
+  <w:font w:name="Symbol">
+    <w:panose1 w:val="05050102010706020507"/>
+    <w:charset w:val="02"/>
+    <w:family w:val="roman"/>
+    <w:pitch w:val="variable"/>
+    <w:sig w:usb0="00000000" w:usb1="10000000" w:usb2="00000000" w:usb3="00000000" w:csb0="80000000" w:csb1="00000000"/>
+  </w:font>
+  <w:font w:name="Arial">
+    <w:panose1 w:val="020B0604020202020204"/>
+    <w:charset w:val="00"/>
+    <w:family w:val="swiss"/>
+    <w:pitch w:val="variable"/>
+    <w:sig w:usb0="E0002EFF" w:usb1="C000785B" w:usb2="00000009" w:usb3="00000000" w:csb0="000001FF" w:csb1="00000000"/>
+  </w:font>
+  <w:font w:name="Courier New">
+    <w:panose1 w:val="02070309020205020404"/>
+    <w:charset w:val="00"/>
+    <w:family w:val="modern"/>
+    <w:pitch w:val="fixed"/>
+    <w:sig w:usb0="E0002EFF" w:usb1="C0007843" w:usb2="00000009" w:usb3="00000000" w:csb0="000001FF" w:csb1="00000000"/>
+  </w:font>
+  <w:font w:name="Times New Roman">
+    <w:panose1 w:val="02020603050405020304"/>
+    <w:charset w:val="00"/>
+    <w:family w:val="roman"/>
+    <w:pitch w:val="variable"/>
+    <w:sig w:usb0="E0002EFF" w:usb1="C000785B" w:usb2="00000009" w:usb3="00000000" w:csb0="000001FF" w:csb1="00000000"/>
+  </w:font>
+  <w:font w:name="Wingdings">
+    <w:panose1 w:val="05000000000000000000"/>
+    <w:charset w:val="02"/>
+    <w:family w:val="auto"/>
+    <w:pitch w:val="variable"/>
+    <w:sig w:usb0="00000000" w:usb1="10000000" w:usb2="00000000" w:usb3="00000000" w:csb0="80000000" w:csb1="00000000"/>
+  </w:font>
+  <w:font w:name="Aptos Display">
+    <w:charset w:val="00"/>
+    <w:family w:val="swiss"/>
+    <w:pitch w:val="variable"/>
+    <w:sig w:usb0="20000287" w:usb1="00000003" w:usb2="00000000" w:usb3="00000000" w:csb0="0000019F" w:csb1="00000000"/>
+  </w:font>
+  <w:font w:name="Aptos">
+    <w:charset w:val="00"/>
+    <w:family w:val="swiss"/>
+    <w:pitch w:val="variable"/>
+    <w:sig w:usb0="20000287" w:usb1="00000003" w:usb2="00000000" w:usb3="00000000" w:csb0="0000019F" w:csb1="00000000"/>
+  </w:font>
+</w:fonts>
+</file>
+
+<file path=word\footer1.xml><?xml version="1.0" encoding="utf-8"?>
 <w:ftr xmlns:wpc="http://schemas.microsoft.com/office/word/2010/wordprocessingCanvas" xmlns:cx="http://schemas.microsoft.com/office/drawing/2014/chartex" xmlns:cx1="http://schemas.microsoft.com/office/drawing/2015/9/8/chartex" xmlns:cx2="http://schemas.microsoft.com/office/drawing/2015/10/21/chartex" xmlns:cx3="http://schemas.microsoft.com/office/drawing/2016/5/9/chartex" xmlns:cx4="http://schemas.microsoft.com/office/drawing/2016/5/10/chartex" xmlns:cx5="http://schemas.microsoft.com/office/drawing/2016/5/11/chartex" xmlns:cx6="http://schemas.microsoft.com/office/drawing/2016/5/12/chartex" xmlns:cx7="http://schemas.microsoft.com/office/drawing/2016/5/13/chartex" xmlns:cx8="http://schemas.microsoft.com/office/drawing/2016/5/14/chartex" xmlns:mc="http://schemas.openxmlformats.org/markup-compatibility/2006" xmlns:aink="http://schemas.microsoft.com/office/drawing/2016/ink" xmlns:am3d="http://schemas.microsoft.com/office/drawing/2017/model3d" xmlns:o="urn:schemas-microsoft-com:office:office" xmlns:oel="http://schemas.microsoft.com/office/2019/extlst" xmlns:r="http://schemas.openxmlformats.org/officeDocument/2006/relationships" xmlns:m="http://schemas.openxmlformats.org/officeDocument/2006/math" xmlns:v="urn:schemas-microsoft-com:vml" xmlns:wp14="http://schemas.microsoft.com/office/word/2010/wordprocessingDrawing" xmlns:wp="http://schemas.openxmlformats.org/drawingml/2006/wordprocessingDrawing" xmlns:w10="urn:schemas-microsoft-com:office:word" xmlns:w="http://schemas.openxmlformats.org/wordprocessingml/2006/main" xmlns:w14="http://schemas.microsoft.com/office/word/2010/wordml" xmlns:w15="http://schemas.microsoft.com/office/word/2012/wordml" xmlns:w16cex="http://schemas.microsoft.com/office/word/2018/wordml/cex" xmlns:w16cid="http://schemas.microsoft.com/office/word/2016/wordml/cid" xmlns:w16="http://schemas.microsoft.com/office/word/2018/wordml" xmlns:w16du="http://schemas.microsoft.com/office/word/2023/wordml/word16du" xmlns:w16sdtdh="http://schemas.microsoft.com/office/word/2020/wordml/sdtdatahash" xmlns:w16sdtfl="http://schemas.microsoft.com/office/word/2024/wordml/sdtformatlock" xmlns:w16se="http://schemas.microsoft.com/office/word/2015/wordml/symex" xmlns:wpg="http://schemas.microsoft.com/office/word/2010/wordprocessingGroup" xmlns:wpi="http://schemas.microsoft.com/office/word/2010/wordprocessingInk" xmlns:wne="http://schemas.microsoft.com/office/word/2006/wordml" xmlns:wps="http://schemas.microsoft.com/office/word/2010/wordprocessingShape" mc:Ignorable="w14 w15 w16se w16cid w16 w16cex w16sdtdh w16sdtfl w16du wp14">
   <w:p>
     <w:pPr>
@@ -25148,7 +25248,7 @@
 </w:ftr>
 </file>
 
-<file path=word/footnotes.xml><?xml version="1.0" encoding="utf-8"?>
+<file path=word\footnotes.xml><?xml version="1.0" encoding="utf-8"?>
 <w:footnotes xmlns:wpc="http://schemas.microsoft.com/office/word/2010/wordprocessingCanvas" xmlns:cx="http://schemas.microsoft.com/office/drawing/2014/chartex" xmlns:cx1="http://schemas.microsoft.com/office/drawing/2015/9/8/chartex" xmlns:cx2="http://schemas.microsoft.com/office/drawing/2015/10/21/chartex" xmlns:cx3="http://schemas.microsoft.com/office/drawing/2016/5/9/chartex" xmlns:cx4="http://schemas.microsoft.com/office/drawing/2016/5/10/chartex" xmlns:cx5="http://schemas.microsoft.com/office/drawing/2016/5/11/chartex" xmlns:cx6="http://schemas.microsoft.com/office/drawing/2016/5/12/chartex" xmlns:cx7="http://schemas.microsoft.com/office/drawing/2016/5/13/chartex" xmlns:cx8="http://schemas.microsoft.com/office/drawing/2016/5/14/chartex" xmlns:mc="http://schemas.openxmlformats.org/markup-compatibility/2006" xmlns:aink="http://schemas.microsoft.com/office/drawing/2016/ink" xmlns:am3d="http://schemas.microsoft.com/office/drawing/2017/model3d" xmlns:o="urn:schemas-microsoft-com:office:office" xmlns:oel="http://schemas.microsoft.com/office/2019/extlst" xmlns:r="http://schemas.openxmlformats.org/officeDocument/2006/relationships" xmlns:m="http://schemas.openxmlformats.org/officeDocument/2006/math" xmlns:v="urn:schemas-microsoft-com:vml" xmlns:wp14="http://schemas.microsoft.com/office/word/2010/wordprocessingDrawing" xmlns:wp="http://schemas.openxmlformats.org/drawingml/2006/wordprocessingDrawing" xmlns:w10="urn:schemas-microsoft-com:office:word" xmlns:w="http://schemas.openxmlformats.org/wordprocessingml/2006/main" xmlns:w14="http://schemas.microsoft.com/office/word/2010/wordml" xmlns:w15="http://schemas.microsoft.com/office/word/2012/wordml" xmlns:w16cex="http://schemas.microsoft.com/office/word/2018/wordml/cex" xmlns:w16cid="http://schemas.microsoft.com/office/word/2016/wordml/cid" xmlns:w16="http://schemas.microsoft.com/office/word/2018/wordml" xmlns:w16du="http://schemas.microsoft.com/office/word/2023/wordml/word16du" xmlns:w16sdtdh="http://schemas.microsoft.com/office/word/2020/wordml/sdtdatahash" xmlns:w16sdtfl="http://schemas.microsoft.com/office/word/2024/wordml/sdtformatlock" xmlns:w16se="http://schemas.microsoft.com/office/word/2015/wordml/symex" xmlns:wpg="http://schemas.microsoft.com/office/word/2010/wordprocessingGroup" xmlns:wpi="http://schemas.microsoft.com/office/word/2010/wordprocessingInk" xmlns:wne="http://schemas.microsoft.com/office/word/2006/wordml" xmlns:wps="http://schemas.microsoft.com/office/word/2010/wordprocessingShape" mc:Ignorable="w14 w15 w16se w16cid w16 w16cex w16sdtdh w16sdtfl w16du wp14">
   <w:footnote w:type="separator" w:id="-1">
     <w:p>
@@ -25167,7 +25267,7 @@
 </w:footnotes>
 </file>
 
-<file path=word/numbering.xml><?xml version="1.0" encoding="utf-8"?>
+<file path=word\numbering.xml><?xml version="1.0" encoding="utf-8"?>
 <w:numbering xmlns:wpc="http://schemas.microsoft.com/office/word/2010/wordprocessingCanvas" xmlns:cx="http://schemas.microsoft.com/office/drawing/2014/chartex" xmlns:cx1="http://schemas.microsoft.com/office/drawing/2015/9/8/chartex" xmlns:cx2="http://schemas.microsoft.com/office/drawing/2015/10/21/chartex" xmlns:cx3="http://schemas.microsoft.com/office/drawing/2016/5/9/chartex" xmlns:cx4="http://schemas.microsoft.com/office/drawing/2016/5/10/chartex" xmlns:cx5="http://schemas.microsoft.com/office/drawing/2016/5/11/chartex" xmlns:cx6="http://schemas.microsoft.com/office/drawing/2016/5/12/chartex" xmlns:cx7="http://schemas.microsoft.com/office/drawing/2016/5/13/chartex" xmlns:cx8="http://schemas.microsoft.com/office/drawing/2016/5/14/chartex" xmlns:mc="http://schemas.openxmlformats.org/markup-compatibility/2006" xmlns:aink="http://schemas.microsoft.com/office/drawing/2016/ink" xmlns:am3d="http://schemas.microsoft.com/office/drawing/2017/model3d" xmlns:o="urn:schemas-microsoft-com:office:office" xmlns:oel="http://schemas.microsoft.com/office/2019/extlst" xmlns:r="http://schemas.openxmlformats.org/officeDocument/2006/relationships" xmlns:m="http://schemas.openxmlformats.org/officeDocument/2006/math" xmlns:v="urn:schemas-microsoft-com:vml" xmlns:wp14="http://schemas.microsoft.com/office/word/2010/wordprocessingDrawing" xmlns:wp="http://schemas.openxmlformats.org/drawingml/2006/wordprocessingDrawing" xmlns:w10="urn:schemas-microsoft-com:office:word" xmlns:w="http://schemas.openxmlformats.org/wordprocessingml/2006/main" xmlns:w14="http://schemas.microsoft.com/office/word/2010/wordml" xmlns:w15="http://schemas.microsoft.com/office/word/2012/wordml" xmlns:w16cex="http://schemas.microsoft.com/office/word/2018/wordml/cex" xmlns:w16cid="http://schemas.microsoft.com/office/word/2016/wordml/cid" xmlns:w16="http://schemas.microsoft.com/office/word/2018/wordml" xmlns:w16du="http://schemas.microsoft.com/office/word/2023/wordml/word16du" xmlns:w16sdtdh="http://schemas.microsoft.com/office/word/2020/wordml/sdtdatahash" xmlns:w16sdtfl="http://schemas.microsoft.com/office/word/2024/wordml/sdtformatlock" xmlns:w16se="http://schemas.microsoft.com/office/word/2015/wordml/symex" xmlns:wpg="http://schemas.microsoft.com/office/word/2010/wordprocessingGroup" xmlns:wpi="http://schemas.microsoft.com/office/word/2010/wordprocessingInk" xmlns:wne="http://schemas.microsoft.com/office/word/2006/wordml" xmlns:wps="http://schemas.microsoft.com/office/word/2010/wordprocessingShape" mc:Ignorable="w14 w15 w16se w16cid w16 w16cex w16sdtdh w16sdtfl w16du wp14">
   <w:abstractNum w:abstractNumId="0" w15:restartNumberingAfterBreak="0">
     <w:nsid w:val="26C340FB"/>
@@ -25560,7 +25660,110 @@
 </w:numbering>
 </file>
 
-<file path=word/styles.xml><?xml version="1.0" encoding="utf-8"?>
+<file path=word\settings.xml><?xml version="1.0" encoding="utf-8"?>
+<w:settings xmlns:mc="http://schemas.openxmlformats.org/markup-compatibility/2006" xmlns:o="urn:schemas-microsoft-com:office:office" xmlns:r="http://schemas.openxmlformats.org/officeDocument/2006/relationships" xmlns:m="http://schemas.openxmlformats.org/officeDocument/2006/math" xmlns:v="urn:schemas-microsoft-com:vml" xmlns:w10="urn:schemas-microsoft-com:office:word" xmlns:w="http://schemas.openxmlformats.org/wordprocessingml/2006/main" xmlns:w14="http://schemas.microsoft.com/office/word/2010/wordml" xmlns:w15="http://schemas.microsoft.com/office/word/2012/wordml" xmlns:w16cex="http://schemas.microsoft.com/office/word/2018/wordml/cex" xmlns:w16cid="http://schemas.microsoft.com/office/word/2016/wordml/cid" xmlns:w16="http://schemas.microsoft.com/office/word/2018/wordml" xmlns:w16du="http://schemas.microsoft.com/office/word/2023/wordml/word16du" xmlns:w16sdtdh="http://schemas.microsoft.com/office/word/2020/wordml/sdtdatahash" xmlns:w16sdtfl="http://schemas.microsoft.com/office/word/2024/wordml/sdtformatlock" xmlns:w16se="http://schemas.microsoft.com/office/word/2015/wordml/symex" xmlns:sl="http://schemas.openxmlformats.org/schemaLibrary/2006/main" mc:Ignorable="w14 w15 w16se w16cid w16 w16cex w16sdtdh w16sdtfl w16du">
+  <w:zoom w:percent="100"/>
+  <w:displayBackgroundShape/>
+  <w:proofState w:spelling="clean" w:grammar="clean"/>
+  <w:defaultTabStop w:val="720"/>
+  <w:characterSpacingControl w:val="doNotCompress"/>
+  <w:footnotePr>
+    <w:footnote w:id="-1"/>
+    <w:footnote w:id="0"/>
+  </w:footnotePr>
+  <w:endnotePr>
+    <w:endnote w:id="-1"/>
+    <w:endnote w:id="0"/>
+  </w:endnotePr>
+  <w:compat>
+    <w:compatSetting w:name="compatibilityMode" w:uri="http://schemas.microsoft.com/office/word" w:val="15"/>
+    <w:compatSetting w:name="overrideTableStyleFontSizeAndJustification" w:uri="http://schemas.microsoft.com/office/word" w:val="1"/>
+    <w:compatSetting w:name="enableOpenTypeFeatures" w:uri="http://schemas.microsoft.com/office/word" w:val="1"/>
+    <w:compatSetting w:name="doNotFlipMirrorIndents" w:uri="http://schemas.microsoft.com/office/word" w:val="1"/>
+    <w:compatSetting w:name="differentiateMultirowTableHeaders" w:uri="http://schemas.microsoft.com/office/word" w:val="1"/>
+    <w:compatSetting w:name="useWord2013TrackBottomHyphenation" w:uri="http://schemas.microsoft.com/office/word" w:val="1"/>
+  </w:compat>
+  <w:rsids>
+    <w:rsidRoot w:val="006470C0"/>
+    <w:rsid w:val="00012830"/>
+    <w:rsid w:val="0005164B"/>
+    <w:rsid w:val="000656D3"/>
+    <w:rsid w:val="00087F94"/>
+    <w:rsid w:val="0015507D"/>
+    <w:rsid w:val="001724D7"/>
+    <w:rsid w:val="00191E75"/>
+    <w:rsid w:val="001D0511"/>
+    <w:rsid w:val="00213352"/>
+    <w:rsid w:val="002D5D76"/>
+    <w:rsid w:val="002E3A3B"/>
+    <w:rsid w:val="003246EC"/>
+    <w:rsid w:val="0039403A"/>
+    <w:rsid w:val="00454CD6"/>
+    <w:rsid w:val="00457D96"/>
+    <w:rsid w:val="004E049A"/>
+    <w:rsid w:val="005028FF"/>
+    <w:rsid w:val="00524DD6"/>
+    <w:rsid w:val="00553665"/>
+    <w:rsid w:val="005C6AF4"/>
+    <w:rsid w:val="0063584F"/>
+    <w:rsid w:val="006470C0"/>
+    <w:rsid w:val="00652875"/>
+    <w:rsid w:val="00663EA6"/>
+    <w:rsid w:val="006A0B92"/>
+    <w:rsid w:val="006A3A2F"/>
+    <w:rsid w:val="007237A4"/>
+    <w:rsid w:val="007F7E7F"/>
+    <w:rsid w:val="00847CDB"/>
+    <w:rsid w:val="008F64EC"/>
+    <w:rsid w:val="00905B9E"/>
+    <w:rsid w:val="00932545"/>
+    <w:rsid w:val="00947307"/>
+    <w:rsid w:val="00980371"/>
+    <w:rsid w:val="009B177E"/>
+    <w:rsid w:val="009C60C1"/>
+    <w:rsid w:val="009E6EA1"/>
+    <w:rsid w:val="00AD3C74"/>
+    <w:rsid w:val="00BD2CD3"/>
+    <w:rsid w:val="00C124A5"/>
+    <w:rsid w:val="00C25A9E"/>
+    <w:rsid w:val="00C4378B"/>
+    <w:rsid w:val="00CE5398"/>
+    <w:rsid w:val="00D45E9E"/>
+    <w:rsid w:val="00D84A90"/>
+    <w:rsid w:val="00D919B3"/>
+    <w:rsid w:val="00F2302D"/>
+    <w:rsid w:val="00F64311"/>
+    <w:rsid w:val="00F715CB"/>
+  </w:rsids>
+  <m:mathPr>
+    <m:mathFont m:val="Cambria Math"/>
+    <m:brkBin m:val="before"/>
+    <m:brkBinSub m:val="--"/>
+    <m:smallFrac m:val="0"/>
+    <m:dispDef/>
+    <m:lMargin m:val="0"/>
+    <m:rMargin m:val="0"/>
+    <m:defJc m:val="centerGroup"/>
+    <m:wrapIndent m:val="1440"/>
+    <m:intLim m:val="subSup"/>
+    <m:naryLim m:val="undOvr"/>
+  </m:mathPr>
+  <w:themeFontLang w:val="en-US" w:bidi="he-IL"/>
+  <w:clrSchemeMapping w:bg1="light1" w:t1="dark1" w:bg2="light2" w:t2="dark2" w:accent1="accent1" w:accent2="accent2" w:accent3="accent3" w:accent4="accent4" w:accent5="accent5" w:accent6="accent6" w:hyperlink="hyperlink" w:followedHyperlink="followedHyperlink"/>
+  <w:shapeDefaults>
+    <o:shapedefaults v:ext="edit" spidmax="1026"/>
+    <o:shapelayout v:ext="edit">
+      <o:idmap v:ext="edit" data="1"/>
+    </o:shapelayout>
+  </w:shapeDefaults>
+  <w:decimalSymbol w:val="."/>
+  <w:listSeparator w:val=","/>
+  <w14:docId w14:val="7FDA4EF5"/>
+  <w15:docId w15:val="{198D1791-6425-4043-AC0D-C19A6321A782}"/>
+</w:settings>
+</file>
+
+<file path=word\styles.xml><?xml version="1.0" encoding="utf-8"?>
 <w:styles xmlns:mc="http://schemas.openxmlformats.org/markup-compatibility/2006" xmlns:r="http://schemas.openxmlformats.org/officeDocument/2006/relationships" xmlns:w="http://schemas.openxmlformats.org/wordprocessingml/2006/main" xmlns:w14="http://schemas.microsoft.com/office/word/2010/wordml" xmlns:w15="http://schemas.microsoft.com/office/word/2012/wordml" xmlns:w16cex="http://schemas.microsoft.com/office/word/2018/wordml/cex" xmlns:w16cid="http://schemas.microsoft.com/office/word/2016/wordml/cid" xmlns:w16="http://schemas.microsoft.com/office/word/2018/wordml" xmlns:w16du="http://schemas.microsoft.com/office/word/2023/wordml/word16du" xmlns:w16sdtdh="http://schemas.microsoft.com/office/word/2020/wordml/sdtdatahash" xmlns:w16sdtfl="http://schemas.microsoft.com/office/word/2024/wordml/sdtformatlock" xmlns:w16se="http://schemas.microsoft.com/office/word/2015/wordml/symex" mc:Ignorable="w14 w15 w16se w16cid w16 w16cex w16sdtdh w16sdtfl w16du">
   <w:docDefaults>
     <w:rPrDefault>
@@ -26166,7 +26369,7 @@
 </w:styles>
 </file>
 
-<file path=word/theme/theme1.xml><?xml version="1.0" encoding="utf-8"?>
+<file path=word\theme\theme1.xml><?xml version="1.0" encoding="utf-8"?>
 <a:theme xmlns:a="http://schemas.openxmlformats.org/drawingml/2006/main" name="Office Theme">
   <a:themeElements>
     <a:clrScheme name="Office">
@@ -26479,4 +26682,8 @@
     </a:ext>
   </a:extLst>
 </a:theme>
+</file>
+
+<file path=word\webSettings.xml><?xml version="1.0" encoding="utf-8"?>
+<w:webSettings xmlns:mc="http://schemas.openxmlformats.org/markup-compatibility/2006" xmlns:r="http://schemas.openxmlformats.org/officeDocument/2006/relationships" xmlns:w="http://schemas.openxmlformats.org/wordprocessingml/2006/main" xmlns:w14="http://schemas.microsoft.com/office/word/2010/wordml" xmlns:w15="http://schemas.microsoft.com/office/word/2012/wordml" xmlns:w16cex="http://schemas.microsoft.com/office/word/2018/wordml/cex" xmlns:w16cid="http://schemas.microsoft.com/office/word/2016/wordml/cid" xmlns:w16="http://schemas.microsoft.com/office/word/2018/wordml" xmlns:w16du="http://schemas.microsoft.com/office/word/2023/wordml/word16du" xmlns:w16sdtdh="http://schemas.microsoft.com/office/word/2020/wordml/sdtdatahash" xmlns:w16sdtfl="http://schemas.microsoft.com/office/word/2024/wordml/sdtformatlock" xmlns:w16se="http://schemas.microsoft.com/office/word/2015/wordml/symex" mc:Ignorable="w14 w15 w16se w16cid w16 w16cex w16sdtdh w16sdtfl w16du"/>
 </file>
</xml_diff>

<commit_message>
Cover page spread vertically: title lower, breathing metadata rows
The cover text now spans most of the first page instead of ending
mid-page; all three derived PDFs rebuilt.

Co-Authored-By: Claude Fable 5 <noreply@anthropic.com>
</commit_message>
<xml_diff>
--- a/הצעת_יוזמה_תנופה_תשפז_סדנת_ארדואינו.docx
+++ b/הצעת_יוזמה_תנופה_תשפז_סדנת_ארדואינו.docx
@@ -52,7 +52,7 @@
     <w:p>
       <w:pPr>
         <w:bidi/>
-        <w:spacing w:after="400" w:line="360" w:lineRule="auto"/>
+        <w:spacing w:before="1400" w:after="600" w:line="360" w:lineRule="auto"/>
         <w:jc w:val="center"/>
         <w:rPr>
           <w:b/>
@@ -111,7 +111,7 @@
     <w:p>
       <w:pPr>
         <w:bidi/>
-        <w:spacing w:after="700" w:line="360" w:lineRule="auto"/>
+        <w:spacing w:after="2000" w:line="360" w:lineRule="auto"/>
         <w:jc w:val="center"/>
         <w:rPr>
           <w:color w:val="000000" w:themeColor="text1"/>
@@ -130,7 +130,7 @@
     <w:p>
       <w:pPr>
         <w:bidi/>
-        <w:spacing w:after="140" w:line="360" w:lineRule="auto"/>
+        <w:spacing w:after="420" w:line="360" w:lineRule="auto"/>
         <w:rPr>
           <w:color w:val="000000" w:themeColor="text1"/>
         </w:rPr>
@@ -178,7 +178,7 @@
     <w:p>
       <w:pPr>
         <w:bidi/>
-        <w:spacing w:after="140" w:line="360" w:lineRule="auto"/>
+        <w:spacing w:after="420" w:line="360" w:lineRule="auto"/>
         <w:rPr>
           <w:color w:val="000000" w:themeColor="text1"/>
           <w:sz w:val="24"/>
@@ -210,7 +210,7 @@
     <w:p>
       <w:pPr>
         <w:bidi/>
-        <w:spacing w:after="140" w:line="360" w:lineRule="auto"/>
+        <w:spacing w:after="420" w:line="360" w:lineRule="auto"/>
         <w:rPr>
           <w:color w:val="000000" w:themeColor="text1"/>
         </w:rPr>
@@ -241,7 +241,7 @@
     <w:p>
       <w:pPr>
         <w:bidi/>
-        <w:spacing w:after="140" w:line="360" w:lineRule="auto"/>
+        <w:spacing w:after="420" w:line="360" w:lineRule="auto"/>
         <w:rPr>
           <w:color w:val="000000" w:themeColor="text1"/>
         </w:rPr>
@@ -270,7 +270,7 @@
     <w:p>
       <w:pPr>
         <w:bidi/>
-        <w:spacing w:after="140" w:line="360" w:lineRule="auto"/>
+        <w:spacing w:after="420" w:line="360" w:lineRule="auto"/>
         <w:rPr>
           <w:color w:val="000000" w:themeColor="text1"/>
         </w:rPr>
@@ -299,7 +299,7 @@
     <w:p>
       <w:pPr>
         <w:bidi/>
-        <w:spacing w:after="140" w:line="360" w:lineRule="auto"/>
+        <w:spacing w:after="420" w:line="360" w:lineRule="auto"/>
         <w:rPr>
           <w:color w:val="000000" w:themeColor="text1"/>
         </w:rPr>
@@ -328,7 +328,7 @@
     <w:p>
       <w:pPr>
         <w:bidi/>
-        <w:spacing w:after="140" w:line="360" w:lineRule="auto"/>
+        <w:spacing w:after="420" w:line="360" w:lineRule="auto"/>
         <w:rPr>
           <w:color w:val="000000" w:themeColor="text1"/>
         </w:rPr>

</xml_diff>